<commit_message>
Add multiple discipline field operations experience to Field HSE resume
Co-Authored-By: Claude Opus 5.5 <noreply@anthropic.com>
Claude-Session: https://claude.ai/code/session_01QFX3qArYXe5Kfzw5367xEF
</commit_message>
<xml_diff>
--- a/SLB_Field_HSE_Specialist_Resume.docx
+++ b/SLB_Field_HSE_Specialist_Resume.docx
@@ -94,7 +94,7 @@
           <w:sz w:val="20"/>
           <w:szCs w:val="20"/>
         </w:rPr>
-        <w:t xml:space="preserve">Field HSE professional with 25 years of experience supporting site and line management to establish and continuously improve HSE culture at Oil &amp; Gas, gas processing, petrochemical and energy worksites in Turkmenistan, Oman, Kazakhstan, the UAE and Qatar. Holds a Diploma in Fire Engineering &amp; Safety Management and a Diploma in Industrial Safety, plus NEBOSH IGC. Experienced in implementing and improving HSE Management Systems (ISO 45001, ISO 14001, Chevron OEMS, Process Safety Management), assessing local risks, developing HSE plans, verifying implementation through field audits, and coordinating the training and competence screening of personnel and subcontractors. Participates in HSE audits and leads incident investigations (ICAM / RCA) with corrective-action tracking. Builds HSE awareness and employee participation through training, communication and behaviour-based safety. PDO Approved HSE Advisor and CPC Approved Lead HSE Engineer, with 20M, 10M, 8M and 5M man-hours without LTI.</w:t>
+        <w:t xml:space="preserve">Field HSE professional with 25 years of experience supporting site and line management to establish and continuously improve HSE culture at Oil &amp; Gas, gas processing, petrochemical and energy worksites in Turkmenistan, Oman, Kazakhstan, the UAE and Qatar. Experienced in multiple discipline field operations, including gas-field O&amp;M, oil-field water flood, multi-well pads, gas injection plant, mechanical, electrical &amp; instrumentation (ME&amp;I) installation, crude-oil pipeline pump stations, hydrocarbon terminals, and refinery, petrochemical, smelter and power plant construction. Holds a Diploma in Fire Engineering &amp; Safety Management and a Diploma in Industrial Safety, plus NEBOSH IGC. Experienced in implementing and improving HSE Management Systems (ISO 45001, ISO 14001, Chevron OEMS, Process Safety Management), assessing local risks, developing HSE plans, verifying implementation through field audits, and coordinating the training and competence screening of personnel and subcontractors. Participates in HSE audits and leads incident investigations (ICAM / RCA) with corrective-action tracking. Builds HSE awareness and employee participation through training, communication and behaviour-based safety. PDO Approved HSE Advisor and CPC Approved Lead HSE Engineer, with 20M, 10M, 8M and 5M man-hours without LTI.</w:t>
       </w:r>
     </w:p>
     <w:p>
@@ -128,7 +128,167 @@
           <w:sz w:val="20"/>
           <w:szCs w:val="20"/>
         </w:rPr>
-        <w:t xml:space="preserve">Quality &amp; HSE Management Systems | ISO 45001 | ISO 14001 | HSE Culture &amp; Line Management Accountability | HSE Leadership | Local Risk Assessment | HSE Plans &amp; Policies Implementation | Implementation Controls &amp; Verification | HSE Audits &amp; Field Evaluations | Incident &amp; Accident Investigation (ICAM / RCA) | Corrective Action Tracking | Personnel &amp; Subcontractor Training | Competence Assessment &amp; Verification | Contractor / Subcontractor HSE Management | Client HSE Requirements (Chevron OEMS, PDO, CPC) | Regulatory Compliance | HSE Awareness &amp; Communication | Incident Prevention &amp; Reporting | Behaviour-Based Safety | JSA | HAZID | HAZOP | LOPA | Bow-Tie | PSSR | MOC | Permit to Work | Confined Space | LOTO | Hot Work | Working at Height | Critical Lifting | Emergency Response | HSE KPI Reporting &amp; Digital Dashboards | Continuous Improvement</w:t>
+        <w:t xml:space="preserve">Multiple Discipline Field Operations | Quality &amp; HSE Management Systems | ISO 45001 | ISO 14001 | HSE Culture &amp; Line Management Accountability | HSE Leadership | Local Risk Assessment | HSE Plans &amp; Policies Implementation | Implementation Controls &amp; Verification | HSE Audits &amp; Field Evaluations | Incident &amp; Accident Investigation (ICAM / RCA) | Corrective Action Tracking | Personnel &amp; Subcontractor Training | Competence Assessment &amp; Verification | Contractor / Subcontractor HSE Management | Client HSE Requirements (Chevron OEMS, PDO, CPC) | Regulatory Compliance | HSE Awareness &amp; Communication | Incident Prevention &amp; Reporting | Behaviour-Based Safety | JSA | HAZID | HAZOP | LOPA | Bow-Tie | PSSR | MOC | Permit to Work | Confined Space | LOTO | Hot Work | Working at Height | Critical Lifting | Emergency Response | HSE KPI Reporting &amp; Digital Dashboards | Continuous Improvement</w:t>
+      </w:r>
+    </w:p>
+    <w:p>
+      <w:pPr>
+        <w:keepNext/>
+        <w:pBdr>
+          <w:bottom w:val="single" w:color="1F3864" w:sz="6" w:space="1"/>
+        </w:pBdr>
+        <w:spacing w:after="80" w:before="220"/>
+      </w:pPr>
+      <w:r>
+        <w:rPr>
+          <w:rFonts w:ascii="Calibri" w:cs="Calibri" w:eastAsia="Calibri" w:hAnsi="Calibri"/>
+          <w:b/>
+          <w:bCs/>
+          <w:color w:val="1F3864"/>
+          <w:sz w:val="22"/>
+          <w:szCs w:val="22"/>
+        </w:rPr>
+        <w:t xml:space="preserve">MULTIPLE DISCIPLINE FIELD OPERATIONS EXPERIENCE</w:t>
+      </w:r>
+    </w:p>
+    <w:p>
+      <w:pPr>
+        <w:pStyle w:val="ListParagraph"/>
+        <w:numPr>
+          <w:ilvl w:val="0"/>
+          <w:numId w:val="2"/>
+        </w:numPr>
+        <w:spacing w:after="40"/>
+      </w:pPr>
+      <w:r>
+        <w:rPr>
+          <w:rFonts w:ascii="Calibri" w:cs="Calibri" w:eastAsia="Calibri" w:hAnsi="Calibri"/>
+          <w:b/>
+          <w:bCs/>
+          <w:sz w:val="20"/>
+          <w:szCs w:val="20"/>
+        </w:rPr>
+        <w:t xml:space="preserve">Gas processing O&amp;M:</w:t>
+      </w:r>
+      <w:r>
+        <w:rPr>
+          <w:rFonts w:ascii="Calibri" w:cs="Calibri" w:eastAsia="Calibri" w:hAnsi="Calibri"/>
+          <w:sz w:val="20"/>
+          <w:szCs w:val="20"/>
+        </w:rPr>
+        <w:t xml:space="preserve"> Galkynysh Gas Field Central Processing Facilities 1 &amp; 1A, Turkmenistan (Petrofac)</w:t>
+      </w:r>
+    </w:p>
+    <w:p>
+      <w:pPr>
+        <w:pStyle w:val="ListParagraph"/>
+        <w:numPr>
+          <w:ilvl w:val="0"/>
+          <w:numId w:val="2"/>
+        </w:numPr>
+        <w:spacing w:after="40"/>
+      </w:pPr>
+      <w:r>
+        <w:rPr>
+          <w:rFonts w:ascii="Calibri" w:cs="Calibri" w:eastAsia="Calibri" w:hAnsi="Calibri"/>
+          <w:b/>
+          <w:bCs/>
+          <w:sz w:val="20"/>
+          <w:szCs w:val="20"/>
+        </w:rPr>
+        <w:t xml:space="preserve">Upstream oil &amp; gas:</w:t>
+      </w:r>
+      <w:r>
+        <w:rPr>
+          <w:rFonts w:ascii="Calibri" w:cs="Calibri" w:eastAsia="Calibri" w:hAnsi="Calibri"/>
+          <w:sz w:val="20"/>
+          <w:szCs w:val="20"/>
+        </w:rPr>
+        <w:t xml:space="preserve"> FGP-WPMP Multi-Well Pads, 3rd Generation Injection (3GI) Plant and 3GP ME&amp;I Installation, Tengizchevroil, Kazakhstan (KSS); PDO Nimr-G &amp; Karim West Water Flood, Oman (Galfar)</w:t>
+      </w:r>
+    </w:p>
+    <w:p>
+      <w:pPr>
+        <w:pStyle w:val="ListParagraph"/>
+        <w:numPr>
+          <w:ilvl w:val="0"/>
+          <w:numId w:val="2"/>
+        </w:numPr>
+        <w:spacing w:after="40"/>
+      </w:pPr>
+      <w:r>
+        <w:rPr>
+          <w:rFonts w:ascii="Calibri" w:cs="Calibri" w:eastAsia="Calibri" w:hAnsi="Calibri"/>
+          <w:b/>
+          <w:bCs/>
+          <w:sz w:val="20"/>
+          <w:szCs w:val="20"/>
+        </w:rPr>
+        <w:t xml:space="preserve">Midstream, pipeline &amp; terminals:</w:t>
+      </w:r>
+      <w:r>
+        <w:rPr>
+          <w:rFonts w:ascii="Calibri" w:cs="Calibri" w:eastAsia="Calibri" w:hAnsi="Calibri"/>
+          <w:sz w:val="20"/>
+          <w:szCs w:val="20"/>
+        </w:rPr>
+        <w:t xml:space="preserve"> CPC crude-oil pipeline pump station expansion, Kazakhstan; Al Duqm liquid bulk terminal (Naphtha, Jet A-1, Diesel, HSFO, LPG, Sulphur, Pet Coke), Oman; GASCO 4th NGL Train, UAE</w:t>
+      </w:r>
+    </w:p>
+    <w:p>
+      <w:pPr>
+        <w:pStyle w:val="ListParagraph"/>
+        <w:numPr>
+          <w:ilvl w:val="0"/>
+          <w:numId w:val="2"/>
+        </w:numPr>
+        <w:spacing w:after="40"/>
+      </w:pPr>
+      <w:r>
+        <w:rPr>
+          <w:rFonts w:ascii="Calibri" w:cs="Calibri" w:eastAsia="Calibri" w:hAnsi="Calibri"/>
+          <w:b/>
+          <w:bCs/>
+          <w:sz w:val="20"/>
+          <w:szCs w:val="20"/>
+        </w:rPr>
+        <w:t xml:space="preserve">Refining, petrochemical &amp; chemical:</w:t>
+      </w:r>
+      <w:r>
+        <w:rPr>
+          <w:rFonts w:ascii="Calibri" w:cs="Calibri" w:eastAsia="Calibri" w:hAnsi="Calibri"/>
+          <w:sz w:val="20"/>
+          <w:szCs w:val="20"/>
+        </w:rPr>
+        <w:t xml:space="preserve"> Carbon Black &amp; Delayed Coker (Samsung–TAKREER); 70 TPD Chlor Alkali Plant; Hazardous Waste Facility (ORPIC); Aromas Solvent Extraction Plant</w:t>
+      </w:r>
+    </w:p>
+    <w:p>
+      <w:pPr>
+        <w:pStyle w:val="ListParagraph"/>
+        <w:numPr>
+          <w:ilvl w:val="0"/>
+          <w:numId w:val="2"/>
+        </w:numPr>
+        <w:spacing w:after="40"/>
+      </w:pPr>
+      <w:r>
+        <w:rPr>
+          <w:rFonts w:ascii="Calibri" w:cs="Calibri" w:eastAsia="Calibri" w:hAnsi="Calibri"/>
+          <w:b/>
+          <w:bCs/>
+          <w:sz w:val="20"/>
+          <w:szCs w:val="20"/>
+        </w:rPr>
+        <w:t xml:space="preserve">Power &amp; metals:</w:t>
+      </w:r>
+      <w:r>
+        <w:rPr>
+          <w:rFonts w:ascii="Calibri" w:cs="Calibri" w:eastAsia="Calibri" w:hAnsi="Calibri"/>
+          <w:sz w:val="20"/>
+          <w:szCs w:val="20"/>
+        </w:rPr>
+        <w:t xml:space="preserve"> Qarn Alam Power Plant Phase-3, Oman; EMAL Smelter Complex and $3.3B Al Taweelah Alumina Refinery, UAE</w:t>
       </w:r>
     </w:p>
     <w:p>

</xml_diff>